<commit_message>
fix: repair corrupted XML in 5 Land Contract Package Word templates
Same fix as SGMS: confirmed byte-identical corrupted templates (Land
Contract, Promissory Note, Acknowledgement of Utility Transfer, Buyer
Contact Information, Waiver of Seller's Disclosure Statement) before
patching, so this ports the exact same repaired files rather than
re-deriving the fix independently.

Also adds AfBa.docx (Affiliated Business Disclosure), which was missing
from this fork entirely -- generateAllFiles() would throw outright
trying to read it, so Land Contract Package generation/publish was
completely broken on this deployment regardless of the XML corruption.

Co-Authored-By: Claude Sonnet 5 <noreply@anthropic.com>
</commit_message>
<xml_diff>
--- a/src/document-templates/land-contract-package/Acknowledgement of Utilities.docx
+++ b/src/document-templates/land-contract-package/Acknowledgement of Utilities.docx
@@ -1,6 +1,173 @@
 
-<file path=word/document.xml><?xml version="1.0" encoding="UTF-8" standalone="yes"?>
-<w:document xmlns:wpc="http://schemas.microsoft.com/office/word/2010/wordprocessingCanvas" xmlns:cx="http://schemas.microsoft.com/office/drawing/2014/chartex" xmlns:cx1="http://schemas.microsoft.com/office/drawing/2015/9/8/chartex" xmlns:cx2="http://schemas.microsoft.com/office/drawing/2015/10/21/chartex" xmlns:cx3="http://schemas.microsoft.com/office/drawing/2016/5/9/chartex" xmlns:cx4="http://schemas.microsoft.com/office/drawing/2016/5/10/chartex" xmlns:cx5="http://schemas.microsoft.com/office/drawing/2016/5/11/chartex" xmlns:cx6="http://schemas.microsoft.com/office/drawing/2016/5/12/chartex" xmlns:cx7="http://schemas.microsoft.com/office/drawing/2016/5/13/chartex" xmlns:cx8="http://schemas.microsoft.com/office/drawing/2016/5/14/chartex" xmlns:mc="http://schemas.openxmlformats.org/markup-compatibility/2006" xmlns:aink="http://schemas.microsoft.com/office/drawing/2016/ink" xmlns:am3d="http://schemas.microsoft.com/office/drawing/2017/model3d" xmlns:o="urn:schemas-microsoft-com:office:office" xmlns:oel="http://schemas.microsoft.com/office/2019/extlst" xmlns:r="http://schemas.openxmlformats.org/officeDocument/2006/relationships" xmlns:m="http://schemas.openxmlformats.org/officeDocument/2006/math" xmlns:v="urn:schemas-microsoft-com:vml" xmlns:wp14="http://schemas.microsoft.com/office/word/2010/wordprocessingDrawing" xmlns:wp="http://schemas.openxmlformats.org/drawingml/2006/wordprocessingDrawing" xmlns:w10="urn:schemas-microsoft-com:office:word" xmlns:w="http://schemas.openxmlformats.org/wordprocessingml/2006/main" xmlns:w14="http://schemas.microsoft.com/office/word/2010/wordml" xmlns:w15="http://schemas.microsoft.com/office/word/2012/wordml" xmlns:w16cex="http://schemas.microsoft.com/office/word/2018/wordml/cex" xmlns:w16cid="http://schemas.microsoft.com/office/word/2016/wordml/cid" xmlns:w16="http://schemas.microsoft.com/office/word/2018/wordml" xmlns:w16sdtdh="http://schemas.microsoft.com/office/word/2020/wordml/sdtdatahash" xmlns:w16se="http://schemas.microsoft.com/office/word/2015/wordml/symex" xmlns:wpg="http://schemas.microsoft.com/office/word/2010/wordprocessingGroup" xmlns:wpi="http://schemas.microsoft.com/office/word/2010/wordprocessingInk" xmlns:wne="http://schemas.microsoft.com/office/word/2006/wordml" xmlns:wps="http://schemas.microsoft.com/office/word/2010/wordprocessingShape" mc:Ignorable="w14 w15 w16se w16cid w16 w16cex w16sdtdh wp14"><w:body><w:p><w:pPr><w:jc w:val="center"/><w:rPr><w:rFonts w:cs="Times New Roman (Body CS)"/><w:caps/><w:u w:val="single"/></w:rPr></w:pPr><w:r><w:rPr><w:rFonts w:cs="Times New Roman (Body CS)"/><w:caps/><w:u w:val="single"/></w:rPr><w:t>ACKNOWLEDGEMENT</w:t></w:r><w:r><w:rPr><w:rFonts w:cs="Times New Roman (Body CS)"/><w:caps/><w:u w:val="single"/></w:rPr><w:t xml:space="preserve"> OF UTILITY TRANSFER</w:t></w:r></w:p><w:p/><w:r><w:t xml:space="preserve">Buyer: {buyer_name}</w:t></w:r></w:p><w:p><w:r><w:t xml:space="preserve">Seller: {seller_name}</w:t></w:r></w:p><w:p><w:r><w:t xml:space="preserve">Property Address: {property_address}</w:t></w:r></w:p><w:p><w:r><w:t xml:space="preserve">Closing Date: {closing_date}</w:t></w:r></w:p><w:p/><w:pPr><w:jc w:val="both"/><w:rPr><w:rFonts w:cstheme="minorHAnsi"/></w:rPr></w:pPr><w:r><w:rPr><w:rFonts w:cstheme="minorHAnsi"/></w:rPr><w:t xml:space="preserve">The party signing below, {buyer_name} (Buyer), acknowledges that to the extent not already completed, Buyers will transfer all Utilities into their name on the date of the closing. Buyer understands that any and all utilities that are activated in the name of the Seller will be disabled following the closing date acknowledged above. This includes, but is not limited to, electricity, gas, and water services. </w:t></w:r></w:p><w:p/><w:p/><w:p/><w:p/><w:p><w:r><w:t>Dated: _____________________</w:t></w:r><w:r><w:tab/></w:r><w:r><w:tab/></w:r><w:r><w:tab/><w:t>By:_________________________________</w:t></w:r></w:p><w:p><w:pPr><w:rPr><w:rFonts w:cstheme="minorHAnsi"/></w:rPr></w:pPr><w:r><w:rPr><w:rFonts w:cstheme="minorHAnsi"/></w:rPr><w:t xml:space="preserve">{buyer_name}</w:t></w:r></w:p><w:p><w:pPr><w:rPr><w:rFonts w:cstheme="minorHAnsi"/></w:rPr></w:pPr></w:p><w:p/><w:p/><w:p/><w:p><w:r><w:t>STATE OF MICHIGAN</w:t></w:r><w:r><w:tab/></w:r><w:r><w:tab/><w:t>)</w:t></w:r></w:p><w:p><w:r><w:t xml:space="preserve">{notary_county_caps})</w:t></w:r></w:p><w:p/><w:pPr><w:rPr><w:rFonts w:cstheme="minorHAnsi"/></w:rPr></w:pPr><w:r><w:rPr><w:rFonts w:cstheme="minorHAnsi"/></w:rPr><w:t xml:space="preserve">Acknowledged before me in {notary_county}, Michigan on {closing_date}, by {buyer_name}.</w:t></w:r></w:p><w:p/><w:p/><w:p><w:r><w:t>__________________________________</w:t></w:r></w:p><w:p><w:r><w:t xml:space="preserve"> </w:t></w:r></w:p><w:p><w:r><w:t xml:space="preserve">Notary public, State of Michigan, County of {notary_county}</w:t></w:r></w:p><w:p><w:r><w:t xml:space="preserve">My commission expires: </w:t></w:r><w:r><w:t xml:space="preserve"> </w:t></w:r></w:p><w:p/><w:sectPr><w:pgSz w:w="12240" w:h="15840"/><w:pgMar w:top="1440" w:right="1440" w:bottom="1440" w:left="1440" w:header="720" w:footer="720" w:gutter="0"/><w:cols w:space="720"/><w:docGrid w:linePitch="360"/></w:sectPr></w:body></w:document>
+<file path=word/document.xml><?xml version="1.0" encoding="utf-8"?>
+<w:document xmlns:wpc="http://schemas.microsoft.com/office/word/2010/wordprocessingCanvas" xmlns:cx="http://schemas.microsoft.com/office/drawing/2014/chartex" xmlns:cx1="http://schemas.microsoft.com/office/drawing/2015/9/8/chartex" xmlns:cx2="http://schemas.microsoft.com/office/drawing/2015/10/21/chartex" xmlns:cx3="http://schemas.microsoft.com/office/drawing/2016/5/9/chartex" xmlns:cx4="http://schemas.microsoft.com/office/drawing/2016/5/10/chartex" xmlns:cx5="http://schemas.microsoft.com/office/drawing/2016/5/11/chartex" xmlns:cx6="http://schemas.microsoft.com/office/drawing/2016/5/12/chartex" xmlns:cx7="http://schemas.microsoft.com/office/drawing/2016/5/13/chartex" xmlns:cx8="http://schemas.microsoft.com/office/drawing/2016/5/14/chartex" xmlns:mc="http://schemas.openxmlformats.org/markup-compatibility/2006" xmlns:aink="http://schemas.microsoft.com/office/drawing/2016/ink" xmlns:am3d="http://schemas.microsoft.com/office/drawing/2017/model3d" xmlns:o="urn:schemas-microsoft-com:office:office" xmlns:oel="http://schemas.microsoft.com/office/2019/extlst" xmlns:r="http://schemas.openxmlformats.org/officeDocument/2006/relationships" xmlns:m="http://schemas.openxmlformats.org/officeDocument/2006/math" xmlns:v="urn:schemas-microsoft-com:vml" xmlns:wp14="http://schemas.microsoft.com/office/word/2010/wordprocessingDrawing" xmlns:wp="http://schemas.openxmlformats.org/drawingml/2006/wordprocessingDrawing" xmlns:w10="urn:schemas-microsoft-com:office:word" xmlns:w="http://schemas.openxmlformats.org/wordprocessingml/2006/main" xmlns:w14="http://schemas.microsoft.com/office/word/2010/wordml" xmlns:w15="http://schemas.microsoft.com/office/word/2012/wordml" xmlns:w16cex="http://schemas.microsoft.com/office/word/2018/wordml/cex" xmlns:w16cid="http://schemas.microsoft.com/office/word/2016/wordml/cid" xmlns:w16="http://schemas.microsoft.com/office/word/2018/wordml" xmlns:w16sdtdh="http://schemas.microsoft.com/office/word/2020/wordml/sdtdatahash" xmlns:w16se="http://schemas.microsoft.com/office/word/2015/wordml/symex" xmlns:wpg="http://schemas.microsoft.com/office/word/2010/wordprocessingGroup" xmlns:wpi="http://schemas.microsoft.com/office/word/2010/wordprocessingInk" xmlns:wne="http://schemas.microsoft.com/office/word/2006/wordml" xmlns:wps="http://schemas.microsoft.com/office/word/2010/wordprocessingShape" mc:Ignorable="w14 w15 w16se w16cid w16 w16cex w16sdtdh wp14">
+  <w:body>
+    <w:p>
+      <w:pPr>
+        <w:jc w:val="center"/>
+        <w:rPr>
+          <w:rFonts w:cs="Times New Roman (Body CS)"/>
+          <w:caps/>
+          <w:u w:val="single"/>
+        </w:rPr>
+      </w:pPr>
+      <w:r>
+        <w:rPr>
+          <w:rFonts w:cs="Times New Roman (Body CS)"/>
+          <w:caps/>
+          <w:u w:val="single"/>
+        </w:rPr>
+        <w:t>ACKNOWLEDGEMENT</w:t>
+      </w:r>
+      <w:r>
+        <w:rPr>
+          <w:rFonts w:cs="Times New Roman (Body CS)"/>
+          <w:caps/>
+          <w:u w:val="single"/>
+        </w:rPr>
+        <w:t xml:space="preserve"> OF UTILITY TRANSFER</w:t>
+      </w:r>
+    </w:p>
+    <w:p>
+      <w:r>
+        <w:t xml:space="preserve">Buyer: {buyer_name}</w:t>
+      </w:r>
+    </w:p>
+    <w:p>
+      <w:r>
+        <w:t xml:space="preserve">Seller: {seller_name}</w:t>
+      </w:r>
+    </w:p>
+    <w:p>
+      <w:r>
+        <w:t xml:space="preserve">Property Address: {property_address}</w:t>
+      </w:r>
+    </w:p>
+    <w:p>
+      <w:r>
+        <w:t xml:space="preserve">Closing Date: {closing_date}</w:t>
+      </w:r>
+    </w:p>
+    <w:p>
+      <w:pPr>
+        <w:jc w:val="both"/>
+        <w:rPr>
+          <w:rFonts w:cstheme="minorHAnsi"/>
+        </w:rPr>
+      </w:pPr>
+      <w:r>
+        <w:rPr>
+          <w:rFonts w:cstheme="minorHAnsi"/>
+        </w:rPr>
+        <w:t xml:space="preserve">The party signing below, {buyer_name} (Buyer), acknowledges that to the extent not already completed, Buyers will transfer all Utilities into their name on the date of the closing. Buyer understands that any and all utilities that are activated in the name of the Seller will be disabled following the closing date acknowledged above. This includes, but is not limited to, electricity, gas, and water services. </w:t>
+      </w:r>
+    </w:p>
+    <w:p/>
+    <w:p/>
+    <w:p/>
+    <w:p/>
+    <w:p>
+      <w:r>
+        <w:t>Dated: _____________________</w:t>
+      </w:r>
+      <w:r>
+        <w:tab/>
+      </w:r>
+      <w:r>
+        <w:tab/>
+      </w:r>
+      <w:r>
+        <w:tab/>
+        <w:t>By:_________________________________</w:t>
+      </w:r>
+    </w:p>
+    <w:p>
+      <w:pPr>
+        <w:rPr>
+          <w:rFonts w:cstheme="minorHAnsi"/>
+        </w:rPr>
+      </w:pPr>
+      <w:r>
+        <w:rPr>
+          <w:rFonts w:cstheme="minorHAnsi"/>
+        </w:rPr>
+        <w:t xml:space="preserve">{buyer_name}</w:t>
+      </w:r>
+    </w:p>
+    <w:p>
+      <w:pPr>
+        <w:rPr>
+          <w:rFonts w:cstheme="minorHAnsi"/>
+        </w:rPr>
+      </w:pPr>
+    </w:p>
+    <w:p/>
+    <w:p/>
+    <w:p/>
+    <w:p>
+      <w:r>
+        <w:t>STATE OF MICHIGAN</w:t>
+      </w:r>
+      <w:r>
+        <w:tab/>
+      </w:r>
+      <w:r>
+        <w:tab/>
+        <w:t>)</w:t>
+      </w:r>
+    </w:p>
+    <w:p>
+      <w:r>
+        <w:t xml:space="preserve">{notary_county_caps})</w:t>
+      </w:r>
+    </w:p>
+    <w:p>
+      <w:pPr>
+        <w:rPr>
+          <w:rFonts w:cstheme="minorHAnsi"/>
+        </w:rPr>
+      </w:pPr>
+      <w:r>
+        <w:rPr>
+          <w:rFonts w:cstheme="minorHAnsi"/>
+        </w:rPr>
+        <w:t xml:space="preserve">Acknowledged before me in {notary_county}, Michigan on {closing_date}, by {buyer_name}.</w:t>
+      </w:r>
+    </w:p>
+    <w:p/>
+    <w:p/>
+    <w:p>
+      <w:r>
+        <w:t>__________________________________</w:t>
+      </w:r>
+    </w:p>
+    <w:p>
+      <w:r>
+        <w:t xml:space="preserve"> </w:t>
+      </w:r>
+    </w:p>
+    <w:p>
+      <w:r>
+        <w:t xml:space="preserve">Notary public, State of Michigan, County of {notary_county}</w:t>
+      </w:r>
+    </w:p>
+    <w:p>
+      <w:r>
+        <w:t xml:space="preserve">My commission expires: </w:t>
+      </w:r>
+      <w:r>
+        <w:t xml:space="preserve"> </w:t>
+      </w:r>
+    </w:p>
+    <w:p/>
+    <w:sectPr>
+      <w:pgSz w:w="12240" w:h="15840"/>
+      <w:pgMar w:top="1440" w:right="1440" w:bottom="1440" w:left="1440" w:header="720" w:footer="720" w:gutter="0"/>
+      <w:cols w:space="720"/>
+      <w:docGrid w:linePitch="360"/>
+    </w:sectPr>
+  </w:body>
+</w:document>
 </file>
 
 <file path=word/styles.xml><?xml version="1.0" encoding="utf-8"?>

</xml_diff>